<commit_message>
Release 7.1.0: page, solution zip, Word guide and XrmToolBox dll
- Several environments in XrmToolBox, ERD multi-select (plus 7.0's dark mode and generic branding)
- DataModelExplorer_7_1_0_0.zip replaces 7_0_0_0; 516 tests pass

Co-Authored-By: Claude Opus 5.5 <noreply@anthropic.com>
Claude-Session: https://claude.ai/code/session_01SKe3s5TvTWyeqUT38hd6Ss
</commit_message>
<xml_diff>
--- a/data-model-explorer-v7/docs/User_Guide.docx
+++ b/data-model-explorer-v7/docs/User_Guide.docx
@@ -45,7 +45,7 @@
         <w:t xml:space="preserve"> </w:t>
       </w:r>
       <w:r>
-        <w:t xml:space="preserve">7.0.0</w:t>
+        <w:t xml:space="preserve">7.1.0</w:t>
       </w:r>
       <w:r>
         <w:t xml:space="preserve"> </w:t>
@@ -57,7 +57,7 @@
         <w:t xml:space="preserve"> </w:t>
       </w:r>
       <w:r>
-        <w:t xml:space="preserve">29</w:t>
+        <w:t xml:space="preserve">30</w:t>
       </w:r>
       <w:r>
         <w:t xml:space="preserve"> </w:t>
@@ -407,6 +407,50 @@
           <w:b/>
         </w:rPr>
         <w:t xml:space="preserve">New in 7.0</w:t>
+      </w:r>
+    </w:p>
+    <w:p>
+      <w:pPr>
+        <w:numPr>
+          <w:ilvl w:val="0"/>
+          <w:numId w:val="1001"/>
+        </w:numPr>
+        <w:pStyle w:val="Compact"/>
+      </w:pPr>
+      <w:r>
+        <w:rPr>
+          <w:bCs/>
+          <w:b/>
+        </w:rPr>
+        <w:t xml:space="preserve">Several environments in XrmToolBox:</w:t>
+      </w:r>
+      <w:r>
+        <w:t xml:space="preserve"> </w:t>
+      </w:r>
+      <w:r>
+        <w:t xml:space="preserve">check the workbook against Dev, Test and Production side by side, or compare a solution across them to find drift (Comparing several environments).</w:t>
+      </w:r>
+    </w:p>
+    <w:p>
+      <w:pPr>
+        <w:numPr>
+          <w:ilvl w:val="0"/>
+          <w:numId w:val="1001"/>
+        </w:numPr>
+        <w:pStyle w:val="Compact"/>
+      </w:pPr>
+      <w:r>
+        <w:rPr>
+          <w:bCs/>
+          <w:b/>
+        </w:rPr>
+        <w:t xml:space="preserve">ERD:</w:t>
+      </w:r>
+      <w:r>
+        <w:t xml:space="preserve"> </w:t>
+      </w:r>
+      <w:r>
+        <w:t xml:space="preserve">select several tables, or all of them, and move them together (The ERD).</w:t>
       </w:r>
     </w:p>
     <w:p>
@@ -4252,6 +4296,88 @@
       <w:r>
         <w:t xml:space="preserve">starts again. Layouts are remembered per selection.</w:t>
       </w:r>
+      <w:r>
+        <w:t xml:space="preserve"> </w:t>
+      </w:r>
+      <w:r>
+        <w:t xml:space="preserve">To move several tables at once, select them first:</w:t>
+      </w:r>
+      <w:r>
+        <w:t xml:space="preserve"> </w:t>
+      </w:r>
+      <w:r>
+        <w:rPr>
+          <w:bCs/>
+          <w:b/>
+        </w:rPr>
+        <w:t xml:space="preserve">Select all</w:t>
+      </w:r>
+      <w:r>
+        <w:t xml:space="preserve"> </w:t>
+      </w:r>
+      <w:r>
+        <w:t xml:space="preserve">above the diagram (or</w:t>
+      </w:r>
+      <w:r>
+        <w:t xml:space="preserve"> </w:t>
+      </w:r>
+      <w:r>
+        <w:rPr>
+          <w:rStyle w:val="VerbatimChar"/>
+        </w:rPr>
+        <w:t xml:space="preserve">Ctrl</w:t>
+      </w:r>
+      <w:r>
+        <w:t xml:space="preserve">+</w:t>
+      </w:r>
+      <w:r>
+        <w:rPr>
+          <w:rStyle w:val="VerbatimChar"/>
+        </w:rPr>
+        <w:t xml:space="preserve">A</w:t>
+      </w:r>
+      <w:r>
+        <w:t xml:space="preserve">),</w:t>
+      </w:r>
+      <w:r>
+        <w:t xml:space="preserve"> </w:t>
+      </w:r>
+      <w:r>
+        <w:rPr>
+          <w:rStyle w:val="VerbatimChar"/>
+        </w:rPr>
+        <w:t xml:space="preserve">Ctrl</w:t>
+      </w:r>
+      <w:r>
+        <w:t xml:space="preserve">+click a table to add or remove it, or hold</w:t>
+      </w:r>
+      <w:r>
+        <w:t xml:space="preserve"> </w:t>
+      </w:r>
+      <w:r>
+        <w:rPr>
+          <w:rStyle w:val="VerbatimChar"/>
+        </w:rPr>
+        <w:t xml:space="preserve">Shift</w:t>
+      </w:r>
+      <w:r>
+        <w:t xml:space="preserve"> </w:t>
+      </w:r>
+      <w:r>
+        <w:t xml:space="preserve">and drag a box over the background. Selected tables have an amber outline, and dragging any of them moves them all.</w:t>
+      </w:r>
+      <w:r>
+        <w:t xml:space="preserve"> </w:t>
+      </w:r>
+      <w:r>
+        <w:rPr>
+          <w:rStyle w:val="VerbatimChar"/>
+        </w:rPr>
+        <w:t xml:space="preserve">Esc</w:t>
+      </w:r>
+      <w:r>
+        <w:t xml:space="preserve">, or a click on the background, clears the selection.</w:t>
+      </w:r>
     </w:p>
     <w:p>
       <w:pPr>
@@ -7845,7 +7971,7 @@
         <w:rPr>
           <w:rStyle w:val="VerbatimChar"/>
         </w:rPr>
-        <w:t xml:space="preserve">DataModelExplorer_7_0_0_0.zip</w:t>
+        <w:t xml:space="preserve">DataModelExplorer_7_1_0_0.zip</w:t>
       </w:r>
       <w:r>
         <w:t xml:space="preserve"> </w:t>
@@ -9202,7 +9328,7 @@
     </w:p>
     <w:bookmarkEnd w:id="97"/>
     <w:bookmarkEnd w:id="98"/>
-    <w:bookmarkStart w:id="101" w:name="using-it-in-xrmtoolbox"/>
+    <w:bookmarkStart w:id="105" w:name="using-it-in-xrmtoolbox"/>
     <w:p>
       <w:pPr>
         <w:pStyle w:val="Heading2"/>
@@ -9479,61 +9605,208 @@
         <w:t xml:space="preserve">Connecting to another environment (the connection button in XrmToolBox’s toolbar) reopens the page on that one.</w:t>
       </w:r>
     </w:p>
+    <w:bookmarkEnd w:id="100"/>
+    <w:bookmarkStart w:id="104" w:name="comparing-several-environments"/>
+    <w:p>
+      <w:pPr>
+        <w:pStyle w:val="Heading3"/>
+      </w:pPr>
+      <w:r>
+        <w:t xml:space="preserve">Comparing several environments</w:t>
+      </w:r>
+    </w:p>
     <w:p>
       <w:pPr>
         <w:pStyle w:val="FirstParagraph"/>
       </w:pPr>
       <w:r>
-        <w:t xml:space="preserve">The page reads the environment with XrmToolBox’s sign-in, as the connected user, and only reads: the tool passes on read requests and refuses anything else. Workbooks, edits and ERD layouts are kept for the next session, in XrmToolBox’s settings folder. Downloads go to your Downloads folder.</w:t>
-      </w:r>
-    </w:p>
-    <w:p>
-      <w:pPr>
-        <w:pStyle w:val="BodyText"/>
-      </w:pPr>
-      <w:r>
-        <w:t xml:space="preserve">It needs the Microsoft Edge WebView2 Runtime (part of Windows 10 and 11) and a connection that signs in with Microsoft 365 (OAuth), a client secret or a certificate. Older on-premises connection types don’t give the tool a token: the page still opens, but can’t read the environment.</w:t>
-      </w:r>
-    </w:p>
-    <w:bookmarkEnd w:id="100"/>
-    <w:bookmarkEnd w:id="101"/>
-    <w:bookmarkStart w:id="112" w:name="updating-the-template"/>
-    <w:p>
-      <w:pPr>
-        <w:pStyle w:val="Heading2"/>
-      </w:pPr>
-      <w:r>
-        <w:t xml:space="preserve">Updating the template</w:t>
-      </w:r>
-    </w:p>
-    <w:p>
-      <w:pPr>
-        <w:pStyle w:val="FirstParagraph"/>
-      </w:pPr>
-      <w:r>
-        <w:t xml:space="preserve">The template sets which columns and table details every workbook has, the dropdown options, and the look of</w:t>
-      </w:r>
-      <w:r>
-        <w:t xml:space="preserve"> </w:t>
-      </w:r>
-      <w:r>
-        <w:rPr>
-          <w:bCs/>
-          <w:b/>
-        </w:rPr>
-        <w:t xml:space="preserve">Rebuilt in the current template</w:t>
-      </w:r>
-      <w:r>
-        <w:t xml:space="preserve">. The page has the current data-model template built in; you can replace it with your own.</w:t>
-      </w:r>
-    </w:p>
-    <w:bookmarkStart w:id="105" w:name="checking-a-workbook-against-the-template"/>
-    <w:p>
-      <w:pPr>
-        <w:pStyle w:val="Heading3"/>
-      </w:pPr>
-      <w:r>
-        <w:t xml:space="preserve">Checking a workbook against the template</w:t>
+        <w:t xml:space="preserve">In XrmToolBox,</w:t>
+      </w:r>
+      <w:r>
+        <w:t xml:space="preserve"> </w:t>
+      </w:r>
+      <w:r>
+        <w:rPr>
+          <w:bCs/>
+          <w:b/>
+        </w:rPr>
+        <w:t xml:space="preserve">This environment</w:t>
+      </w:r>
+      <w:r>
+        <w:t xml:space="preserve"> </w:t>
+      </w:r>
+      <w:r>
+        <w:t xml:space="preserve">also lists</w:t>
+      </w:r>
+      <w:r>
+        <w:t xml:space="preserve"> </w:t>
+      </w:r>
+      <w:r>
+        <w:rPr>
+          <w:bCs/>
+          <w:b/>
+        </w:rPr>
+        <w:t xml:space="preserve">Other environments</w:t>
+      </w:r>
+      <w:r>
+        <w:t xml:space="preserve">: the one the page is open on, plus any you add.</w:t>
+      </w:r>
+    </w:p>
+    <w:p>
+      <w:pPr>
+        <w:numPr>
+          <w:ilvl w:val="0"/>
+          <w:numId w:val="1021"/>
+        </w:numPr>
+        <w:pStyle w:val="Compact"/>
+      </w:pPr>
+      <w:r>
+        <w:t xml:space="preserve">Click</w:t>
+      </w:r>
+      <w:r>
+        <w:t xml:space="preserve"> </w:t>
+      </w:r>
+      <w:r>
+        <w:rPr>
+          <w:bCs/>
+          <w:b/>
+        </w:rPr>
+        <w:t xml:space="preserve">Add environment…</w:t>
+      </w:r>
+      <w:r>
+        <w:t xml:space="preserve"> </w:t>
+      </w:r>
+      <w:r>
+        <w:t xml:space="preserve">and pick a connection in XrmToolBox’s connection window (for example Test and Production). Each one is listed with its address; ✕ removes it.</w:t>
+      </w:r>
+    </w:p>
+    <w:p>
+      <w:pPr>
+        <w:numPr>
+          <w:ilvl w:val="0"/>
+          <w:numId w:val="1021"/>
+        </w:numPr>
+        <w:pStyle w:val="Compact"/>
+      </w:pPr>
+      <w:r>
+        <w:t xml:space="preserve">Compare them in one of two ways:</w:t>
+      </w:r>
+    </w:p>
+    <w:p>
+      <w:pPr>
+        <w:numPr>
+          <w:ilvl w:val="1"/>
+          <w:numId w:val="1022"/>
+        </w:numPr>
+        <w:pStyle w:val="Compact"/>
+      </w:pPr>
+      <w:r>
+        <w:rPr>
+          <w:bCs/>
+          <w:b/>
+        </w:rPr>
+        <w:t xml:space="preserve">Check this workbook against all</w:t>
+      </w:r>
+      <w:r>
+        <w:t xml:space="preserve">: the checks of This environment (not built, undocumented, type and required-level differences and, with</w:t>
+      </w:r>
+      <w:r>
+        <w:t xml:space="preserve"> </w:t>
+      </w:r>
+      <w:r>
+        <w:rPr>
+          <w:bCs/>
+          <w:b/>
+        </w:rPr>
+        <w:t xml:space="preserve">Managed environment</w:t>
+      </w:r>
+      <w:r>
+        <w:t xml:space="preserve"> </w:t>
+      </w:r>
+      <w:r>
+        <w:t xml:space="preserve">ticked, unmanaged changes) run in every environment and are lined up, a column per environment. ✓ means as the workbook. With a solution picked in the list, each environment is checked against its copy of that solution (by unique name), with its version shown.</w:t>
+      </w:r>
+    </w:p>
+    <w:p>
+      <w:pPr>
+        <w:numPr>
+          <w:ilvl w:val="1"/>
+          <w:numId w:val="1022"/>
+        </w:numPr>
+        <w:pStyle w:val="Compact"/>
+      </w:pPr>
+      <w:r>
+        <w:rPr>
+          <w:bCs/>
+          <w:b/>
+        </w:rPr>
+        <w:t xml:space="preserve">Compare … across them</w:t>
+      </w:r>
+      <w:r>
+        <w:t xml:space="preserve"> </w:t>
+      </w:r>
+      <w:r>
+        <w:t xml:space="preserve">(pick a solution first): no workbook needed. The solution’s tables and columns are read from each environment, and every table or column that is missing somewhere, or has a different type, required level, display name or settings (length, format, choices, targets), is listed with each environment’s value.</w:t>
+      </w:r>
+    </w:p>
+    <w:p>
+      <w:pPr>
+        <w:numPr>
+          <w:ilvl w:val="0"/>
+          <w:numId w:val="1021"/>
+        </w:numPr>
+        <w:pStyle w:val="Compact"/>
+      </w:pPr>
+      <w:r>
+        <w:t xml:space="preserve">The results open on their own page: filter the rows, untick</w:t>
+      </w:r>
+      <w:r>
+        <w:t xml:space="preserve"> </w:t>
+      </w:r>
+      <w:r>
+        <w:rPr>
+          <w:bCs/>
+          <w:b/>
+        </w:rPr>
+        <w:t xml:space="preserve">Differences only</w:t>
+      </w:r>
+      <w:r>
+        <w:t xml:space="preserve"> </w:t>
+      </w:r>
+      <w:r>
+        <w:t xml:space="preserve">to see everything, and</w:t>
+      </w:r>
+      <w:r>
+        <w:t xml:space="preserve"> </w:t>
+      </w:r>
+      <w:r>
+        <w:rPr>
+          <w:bCs/>
+          <w:b/>
+        </w:rPr>
+        <w:t xml:space="preserve">Download CSV</w:t>
+      </w:r>
+      <w:r>
+        <w:t xml:space="preserve"> </w:t>
+      </w:r>
+      <w:r>
+        <w:t xml:space="preserve">to keep them.</w:t>
+      </w:r>
+      <w:r>
+        <w:t xml:space="preserve"> </w:t>
+      </w:r>
+      <w:r>
+        <w:rPr>
+          <w:bCs/>
+          <w:b/>
+        </w:rPr>
+        <w:t xml:space="preserve">Last comparison</w:t>
+      </w:r>
+      <w:r>
+        <w:t xml:space="preserve"> </w:t>
+      </w:r>
+      <w:r>
+        <w:t xml:space="preserve">in the panel opens them again.</w:t>
       </w:r>
     </w:p>
     <w:p>
@@ -9543,20 +9816,140 @@
       <w:r>
         <w:drawing>
           <wp:inline>
-            <wp:extent cx="2258568" cy="2068731"/>
+            <wp:extent cx="5334000" cy="1918047"/>
             <wp:effectExtent b="0" l="0" r="0" t="0"/>
-            <wp:docPr descr="The Check menu" title="" id="103" name="Picture"/>
+            <wp:docPr descr="A solution compared across two environments" title="" id="102" name="Picture"/>
             <a:graphic>
               <a:graphicData uri="http://schemas.openxmlformats.org/drawingml/2006/picture">
                 <pic:pic>
                   <pic:nvPicPr>
-                    <pic:cNvPr descr="images/14-check.png" id="104" name="Picture"/>
+                    <pic:cNvPr descr="images/24-environments.png" id="103" name="Picture"/>
                     <pic:cNvPicPr>
                       <a:picLocks noChangeArrowheads="1" noChangeAspect="1"/>
                     </pic:cNvPicPr>
                   </pic:nvPicPr>
                   <pic:blipFill>
-                    <a:blip r:embed="rId102"/>
+                    <a:blip r:embed="rId101"/>
+                    <a:stretch>
+                      <a:fillRect/>
+                    </a:stretch>
+                  </pic:blipFill>
+                  <pic:spPr bwMode="auto">
+                    <a:xfrm>
+                      <a:off x="0" y="0"/>
+                      <a:ext cx="5334000" cy="1918047"/>
+                    </a:xfrm>
+                    <a:prstGeom prst="rect">
+                      <a:avLst/>
+                    </a:prstGeom>
+                    <a:noFill/>
+                    <a:ln w="9525">
+                      <a:noFill/>
+                      <a:headEnd/>
+                      <a:tailEnd/>
+                    </a:ln>
+                  </pic:spPr>
+                </pic:pic>
+              </a:graphicData>
+            </a:graphic>
+          </wp:inline>
+        </w:drawing>
+      </w:r>
+    </w:p>
+    <w:p>
+      <w:pPr>
+        <w:pStyle w:val="ImageCaption"/>
+      </w:pPr>
+      <w:r>
+        <w:t xml:space="preserve">A solution compared across two environments</w:t>
+      </w:r>
+    </w:p>
+    <w:p>
+      <w:pPr>
+        <w:pStyle w:val="BodyText"/>
+      </w:pPr>
+      <w:r>
+        <w:t xml:space="preserve">Each environment is read with its own XrmToolBox connection, and only read. Comparing several environments needs the XrmToolBox tool; inside Dynamics 365 the page reads only the environment it is open in.</w:t>
+      </w:r>
+    </w:p>
+    <w:p>
+      <w:pPr>
+        <w:pStyle w:val="BodyText"/>
+      </w:pPr>
+      <w:r>
+        <w:t xml:space="preserve">The page reads the environment with XrmToolBox’s sign-in, as the connected user, and only reads: the tool passes on read requests and refuses anything else. Workbooks, edits and ERD layouts are kept for the next session, in XrmToolBox’s settings folder. Downloads go to your Downloads folder.</w:t>
+      </w:r>
+    </w:p>
+    <w:p>
+      <w:pPr>
+        <w:pStyle w:val="BodyText"/>
+      </w:pPr>
+      <w:r>
+        <w:t xml:space="preserve">It needs the Microsoft Edge WebView2 Runtime (part of Windows 10 and 11) and a connection that signs in with Microsoft 365 (OAuth), a client secret or a certificate. Older on-premises connection types don’t give the tool a token: the page still opens, but can’t read the environment.</w:t>
+      </w:r>
+    </w:p>
+    <w:bookmarkEnd w:id="104"/>
+    <w:bookmarkEnd w:id="105"/>
+    <w:bookmarkStart w:id="116" w:name="updating-the-template"/>
+    <w:p>
+      <w:pPr>
+        <w:pStyle w:val="Heading2"/>
+      </w:pPr>
+      <w:r>
+        <w:t xml:space="preserve">Updating the template</w:t>
+      </w:r>
+    </w:p>
+    <w:p>
+      <w:pPr>
+        <w:pStyle w:val="FirstParagraph"/>
+      </w:pPr>
+      <w:r>
+        <w:t xml:space="preserve">The template sets which columns and table details every workbook has, the dropdown options, and the look of</w:t>
+      </w:r>
+      <w:r>
+        <w:t xml:space="preserve"> </w:t>
+      </w:r>
+      <w:r>
+        <w:rPr>
+          <w:bCs/>
+          <w:b/>
+        </w:rPr>
+        <w:t xml:space="preserve">Rebuilt in the current template</w:t>
+      </w:r>
+      <w:r>
+        <w:t xml:space="preserve">. The page has the current data-model template built in; you can replace it with your own.</w:t>
+      </w:r>
+    </w:p>
+    <w:bookmarkStart w:id="109" w:name="checking-a-workbook-against-the-template"/>
+    <w:p>
+      <w:pPr>
+        <w:pStyle w:val="Heading3"/>
+      </w:pPr>
+      <w:r>
+        <w:t xml:space="preserve">Checking a workbook against the template</w:t>
+      </w:r>
+    </w:p>
+    <w:p>
+      <w:pPr>
+        <w:pStyle w:val="CaptionedFigure"/>
+      </w:pPr>
+      <w:r>
+        <w:drawing>
+          <wp:inline>
+            <wp:extent cx="2258568" cy="2068731"/>
+            <wp:effectExtent b="0" l="0" r="0" t="0"/>
+            <wp:docPr descr="The Check menu" title="" id="107" name="Picture"/>
+            <a:graphic>
+              <a:graphicData uri="http://schemas.openxmlformats.org/drawingml/2006/picture">
+                <pic:pic>
+                  <pic:nvPicPr>
+                    <pic:cNvPr descr="images/14-check.png" id="108" name="Picture"/>
+                    <pic:cNvPicPr>
+                      <a:picLocks noChangeArrowheads="1" noChangeAspect="1"/>
+                    </pic:cNvPicPr>
+                  </pic:nvPicPr>
+                  <pic:blipFill>
+                    <a:blip r:embed="rId106"/>
                     <a:stretch>
                       <a:fillRect/>
                     </a:stretch>
@@ -9662,127 +10055,14 @@
         <w:t xml:space="preserve">. The panel lists tables not in the template, extra columns the workbook has, and columns or details it is missing. A pink count on the button shows how many tables differ.</w:t>
       </w:r>
     </w:p>
-    <w:bookmarkEnd w:id="105"/>
-    <w:bookmarkStart w:id="106" w:name="bringing-an-older-workbook-up-to-date"/>
+    <w:bookmarkEnd w:id="109"/>
+    <w:bookmarkStart w:id="110" w:name="bringing-an-older-workbook-up-to-date"/>
     <w:p>
       <w:pPr>
         <w:pStyle w:val="Heading3"/>
       </w:pPr>
       <w:r>
         <w:t xml:space="preserve">Bringing an older workbook up to date</w:t>
-      </w:r>
-    </w:p>
-    <w:p>
-      <w:pPr>
-        <w:numPr>
-          <w:ilvl w:val="0"/>
-          <w:numId w:val="1021"/>
-        </w:numPr>
-        <w:pStyle w:val="Compact"/>
-      </w:pPr>
-      <w:r>
-        <w:t xml:space="preserve">Open the workbook. Columns and table details it lacks (for example Relationship Type, Cascade Delete, Primary Name Column) are added in the page and marked</w:t>
-      </w:r>
-      <w:r>
-        <w:t xml:space="preserve"> </w:t>
-      </w:r>
-      <w:r>
-        <w:rPr>
-          <w:bCs/>
-          <w:b/>
-        </w:rPr>
-        <w:t xml:space="preserve">added</w:t>
-      </w:r>
-      <w:r>
-        <w:t xml:space="preserve">.</w:t>
-      </w:r>
-    </w:p>
-    <w:p>
-      <w:pPr>
-        <w:numPr>
-          <w:ilvl w:val="0"/>
-          <w:numId w:val="1021"/>
-        </w:numPr>
-        <w:pStyle w:val="Compact"/>
-      </w:pPr>
-      <w:r>
-        <w:t xml:space="preserve">Fill them in where you need them.</w:t>
-      </w:r>
-    </w:p>
-    <w:p>
-      <w:pPr>
-        <w:numPr>
-          <w:ilvl w:val="0"/>
-          <w:numId w:val="1021"/>
-        </w:numPr>
-        <w:pStyle w:val="Compact"/>
-      </w:pPr>
-      <w:r>
-        <w:t xml:space="preserve">Save it one of two ways:</w:t>
-      </w:r>
-    </w:p>
-    <w:p>
-      <w:pPr>
-        <w:numPr>
-          <w:ilvl w:val="1"/>
-          <w:numId w:val="1022"/>
-        </w:numPr>
-        <w:pStyle w:val="Compact"/>
-      </w:pPr>
-      <w:r>
-        <w:rPr>
-          <w:bCs/>
-          <w:b/>
-        </w:rPr>
-        <w:t xml:space="preserve">Save</w:t>
-      </w:r>
-      <w:r>
-        <w:t xml:space="preserve"> </w:t>
-      </w:r>
-      <w:r>
-        <w:t xml:space="preserve">or</w:t>
-      </w:r>
-      <w:r>
-        <w:t xml:space="preserve"> </w:t>
-      </w:r>
-      <w:r>
-        <w:rPr>
-          <w:bCs/>
-          <w:b/>
-        </w:rPr>
-        <w:t xml:space="preserve">Save as…</w:t>
-      </w:r>
-      <w:r>
-        <w:t xml:space="preserve">: only the added columns you filled in are written, with their headers and hints.</w:t>
-      </w:r>
-    </w:p>
-    <w:p>
-      <w:pPr>
-        <w:numPr>
-          <w:ilvl w:val="1"/>
-          <w:numId w:val="1022"/>
-        </w:numPr>
-        <w:pStyle w:val="Compact"/>
-      </w:pPr>
-      <w:r>
-        <w:rPr>
-          <w:bCs/>
-          <w:b/>
-        </w:rPr>
-        <w:t xml:space="preserve">Rebuilt in the current template</w:t>
-      </w:r>
-      <w:r>
-        <w:t xml:space="preserve">: the whole workbook rebuilt in the current template layout, every column and detail included.</w:t>
-      </w:r>
-    </w:p>
-    <w:bookmarkEnd w:id="106"/>
-    <w:bookmarkStart w:id="110" w:name="using-your-own-template"/>
-    <w:p>
-      <w:pPr>
-        <w:pStyle w:val="Heading3"/>
-      </w:pPr>
-      <w:r>
-        <w:t xml:space="preserve">Using your own template</w:t>
       </w:r>
     </w:p>
     <w:p>
@@ -9794,17 +10074,20 @@
         <w:pStyle w:val="Compact"/>
       </w:pPr>
       <w:r>
-        <w:rPr>
-          <w:bCs/>
-          <w:b/>
-        </w:rPr>
-        <w:t xml:space="preserve">Check ▾ → Template → Download blank template</w:t>
-      </w:r>
-      <w:r>
-        <w:t xml:space="preserve"> </w:t>
-      </w:r>
-      <w:r>
-        <w:t xml:space="preserve">to start from the current one.</w:t>
+        <w:t xml:space="preserve">Open the workbook. Columns and table details it lacks (for example Relationship Type, Cascade Delete, Primary Name Column) are added in the page and marked</w:t>
+      </w:r>
+      <w:r>
+        <w:t xml:space="preserve"> </w:t>
+      </w:r>
+      <w:r>
+        <w:rPr>
+          <w:bCs/>
+          <w:b/>
+        </w:rPr>
+        <w:t xml:space="preserve">added</w:t>
+      </w:r>
+      <w:r>
+        <w:t xml:space="preserve">.</w:t>
       </w:r>
     </w:p>
     <w:p>
@@ -9816,31 +10099,7 @@
         <w:pStyle w:val="Compact"/>
       </w:pPr>
       <w:r>
-        <w:t xml:space="preserve">Change it in Excel and keep the layout: the Table Dictionary, and one example table tab with its detail rows, hint row and header row starting</w:t>
-      </w:r>
-      <w:r>
-        <w:t xml:space="preserve"> </w:t>
-      </w:r>
-      <w:r>
-        <w:rPr>
-          <w:rStyle w:val="VerbatimChar"/>
-        </w:rPr>
-        <w:t xml:space="preserve">Logical Name</w:t>
-      </w:r>
-      <w:r>
-        <w:t xml:space="preserve">,</w:t>
-      </w:r>
-      <w:r>
-        <w:t xml:space="preserve"> </w:t>
-      </w:r>
-      <w:r>
-        <w:rPr>
-          <w:rStyle w:val="VerbatimChar"/>
-        </w:rPr>
-        <w:t xml:space="preserve">Schema Name</w:t>
-      </w:r>
-      <w:r>
-        <w:t xml:space="preserve">.</w:t>
+        <w:t xml:space="preserve">Fill them in where you need them.</w:t>
       </w:r>
     </w:p>
     <w:p>
@@ -9852,40 +10111,174 @@
         <w:pStyle w:val="Compact"/>
       </w:pPr>
       <w:r>
-        <w:rPr>
-          <w:bCs/>
-          <w:b/>
-        </w:rPr>
-        <w:t xml:space="preserve">Template → Use a different template…</w:t>
-      </w:r>
-      <w:r>
-        <w:t xml:space="preserve"> </w:t>
-      </w:r>
-      <w:r>
-        <w:t xml:space="preserve">and pick your file. The page remembers it in this browser;</w:t>
-      </w:r>
-      <w:r>
-        <w:t xml:space="preserve"> </w:t>
-      </w:r>
-      <w:r>
-        <w:rPr>
-          <w:bCs/>
-          <w:b/>
-        </w:rPr>
-        <w:t xml:space="preserve">Reset to bundled</w:t>
-      </w:r>
-      <w:r>
-        <w:t xml:space="preserve"> </w:t>
-      </w:r>
-      <w:r>
-        <w:t xml:space="preserve">goes back to the built-in one.</w:t>
+        <w:t xml:space="preserve">Save it one of two ways:</w:t>
+      </w:r>
+    </w:p>
+    <w:p>
+      <w:pPr>
+        <w:numPr>
+          <w:ilvl w:val="1"/>
+          <w:numId w:val="1024"/>
+        </w:numPr>
+        <w:pStyle w:val="Compact"/>
+      </w:pPr>
+      <w:r>
+        <w:rPr>
+          <w:bCs/>
+          <w:b/>
+        </w:rPr>
+        <w:t xml:space="preserve">Save</w:t>
+      </w:r>
+      <w:r>
+        <w:t xml:space="preserve"> </w:t>
+      </w:r>
+      <w:r>
+        <w:t xml:space="preserve">or</w:t>
+      </w:r>
+      <w:r>
+        <w:t xml:space="preserve"> </w:t>
+      </w:r>
+      <w:r>
+        <w:rPr>
+          <w:bCs/>
+          <w:b/>
+        </w:rPr>
+        <w:t xml:space="preserve">Save as…</w:t>
+      </w:r>
+      <w:r>
+        <w:t xml:space="preserve">: only the added columns you filled in are written, with their headers and hints.</w:t>
+      </w:r>
+    </w:p>
+    <w:p>
+      <w:pPr>
+        <w:numPr>
+          <w:ilvl w:val="1"/>
+          <w:numId w:val="1024"/>
+        </w:numPr>
+        <w:pStyle w:val="Compact"/>
+      </w:pPr>
+      <w:r>
+        <w:rPr>
+          <w:bCs/>
+          <w:b/>
+        </w:rPr>
+        <w:t xml:space="preserve">Rebuilt in the current template</w:t>
+      </w:r>
+      <w:r>
+        <w:t xml:space="preserve">: the whole workbook rebuilt in the current template layout, every column and detail included.</w:t>
+      </w:r>
+    </w:p>
+    <w:bookmarkEnd w:id="110"/>
+    <w:bookmarkStart w:id="114" w:name="using-your-own-template"/>
+    <w:p>
+      <w:pPr>
+        <w:pStyle w:val="Heading3"/>
+      </w:pPr>
+      <w:r>
+        <w:t xml:space="preserve">Using your own template</w:t>
       </w:r>
     </w:p>
     <w:p>
       <w:pPr>
         <w:numPr>
           <w:ilvl w:val="0"/>
-          <w:numId w:val="1023"/>
+          <w:numId w:val="1025"/>
+        </w:numPr>
+        <w:pStyle w:val="Compact"/>
+      </w:pPr>
+      <w:r>
+        <w:rPr>
+          <w:bCs/>
+          <w:b/>
+        </w:rPr>
+        <w:t xml:space="preserve">Check ▾ → Template → Download blank template</w:t>
+      </w:r>
+      <w:r>
+        <w:t xml:space="preserve"> </w:t>
+      </w:r>
+      <w:r>
+        <w:t xml:space="preserve">to start from the current one.</w:t>
+      </w:r>
+    </w:p>
+    <w:p>
+      <w:pPr>
+        <w:numPr>
+          <w:ilvl w:val="0"/>
+          <w:numId w:val="1025"/>
+        </w:numPr>
+        <w:pStyle w:val="Compact"/>
+      </w:pPr>
+      <w:r>
+        <w:t xml:space="preserve">Change it in Excel and keep the layout: the Table Dictionary, and one example table tab with its detail rows, hint row and header row starting</w:t>
+      </w:r>
+      <w:r>
+        <w:t xml:space="preserve"> </w:t>
+      </w:r>
+      <w:r>
+        <w:rPr>
+          <w:rStyle w:val="VerbatimChar"/>
+        </w:rPr>
+        <w:t xml:space="preserve">Logical Name</w:t>
+      </w:r>
+      <w:r>
+        <w:t xml:space="preserve">,</w:t>
+      </w:r>
+      <w:r>
+        <w:t xml:space="preserve"> </w:t>
+      </w:r>
+      <w:r>
+        <w:rPr>
+          <w:rStyle w:val="VerbatimChar"/>
+        </w:rPr>
+        <w:t xml:space="preserve">Schema Name</w:t>
+      </w:r>
+      <w:r>
+        <w:t xml:space="preserve">.</w:t>
+      </w:r>
+    </w:p>
+    <w:p>
+      <w:pPr>
+        <w:numPr>
+          <w:ilvl w:val="0"/>
+          <w:numId w:val="1025"/>
+        </w:numPr>
+        <w:pStyle w:val="Compact"/>
+      </w:pPr>
+      <w:r>
+        <w:rPr>
+          <w:bCs/>
+          <w:b/>
+        </w:rPr>
+        <w:t xml:space="preserve">Template → Use a different template…</w:t>
+      </w:r>
+      <w:r>
+        <w:t xml:space="preserve"> </w:t>
+      </w:r>
+      <w:r>
+        <w:t xml:space="preserve">and pick your file. The page remembers it in this browser;</w:t>
+      </w:r>
+      <w:r>
+        <w:t xml:space="preserve"> </w:t>
+      </w:r>
+      <w:r>
+        <w:rPr>
+          <w:bCs/>
+          <w:b/>
+        </w:rPr>
+        <w:t xml:space="preserve">Reset to bundled</w:t>
+      </w:r>
+      <w:r>
+        <w:t xml:space="preserve"> </w:t>
+      </w:r>
+      <w:r>
+        <w:t xml:space="preserve">goes back to the built-in one.</w:t>
+      </w:r>
+    </w:p>
+    <w:p>
+      <w:pPr>
+        <w:numPr>
+          <w:ilvl w:val="0"/>
+          <w:numId w:val="1025"/>
         </w:numPr>
         <w:pStyle w:val="Compact"/>
       </w:pPr>
@@ -9902,18 +10295,18 @@
           <wp:inline>
             <wp:extent cx="3264407" cy="2621270"/>
             <wp:effectExtent b="0" l="0" r="0" t="0"/>
-            <wp:docPr descr="The Template panel" title="" id="108" name="Picture"/>
+            <wp:docPr descr="The Template panel" title="" id="112" name="Picture"/>
             <a:graphic>
               <a:graphicData uri="http://schemas.openxmlformats.org/drawingml/2006/picture">
                 <pic:pic>
                   <pic:nvPicPr>
-                    <pic:cNvPr descr="images/15-template.png" id="109" name="Picture"/>
+                    <pic:cNvPr descr="images/15-template.png" id="113" name="Picture"/>
                     <pic:cNvPicPr>
                       <a:picLocks noChangeArrowheads="1" noChangeAspect="1"/>
                     </pic:cNvPicPr>
                   </pic:nvPicPr>
                   <pic:blipFill>
-                    <a:blip r:embed="rId107"/>
+                    <a:blip r:embed="rId111"/>
                     <a:stretch>
                       <a:fillRect/>
                     </a:stretch>
@@ -9998,8 +10391,8 @@
         <w:t xml:space="preserve">Reset to bundled</w:t>
       </w:r>
     </w:p>
-    <w:bookmarkEnd w:id="110"/>
-    <w:bookmarkStart w:id="111" w:name="what-you-can-change"/>
+    <w:bookmarkEnd w:id="114"/>
+    <w:bookmarkStart w:id="115" w:name="what-you-can-change"/>
     <w:p>
       <w:pPr>
         <w:pStyle w:val="Heading3"/>
@@ -10233,9 +10626,9 @@
         <w:t xml:space="preserve">A new column needs a code change only if the solution builder or a check should use it.</w:t>
       </w:r>
     </w:p>
-    <w:bookmarkEnd w:id="111"/>
-    <w:bookmarkEnd w:id="112"/>
-    <w:bookmarkStart w:id="116" w:name="comparing-with-a-solution"/>
+    <w:bookmarkEnd w:id="115"/>
+    <w:bookmarkEnd w:id="116"/>
+    <w:bookmarkStart w:id="120" w:name="comparing-with-a-solution"/>
     <w:p>
       <w:pPr>
         <w:pStyle w:val="Heading2"/>
@@ -10256,7 +10649,7 @@
       <w:pPr>
         <w:numPr>
           <w:ilvl w:val="0"/>
-          <w:numId w:val="1024"/>
+          <w:numId w:val="1026"/>
         </w:numPr>
         <w:pStyle w:val="Compact"/>
       </w:pPr>
@@ -10297,7 +10690,7 @@
       <w:pPr>
         <w:numPr>
           <w:ilvl w:val="0"/>
-          <w:numId w:val="1024"/>
+          <w:numId w:val="1026"/>
         </w:numPr>
         <w:pStyle w:val="Compact"/>
       </w:pPr>
@@ -10338,7 +10731,7 @@
       <w:pPr>
         <w:numPr>
           <w:ilvl w:val="0"/>
-          <w:numId w:val="1024"/>
+          <w:numId w:val="1026"/>
         </w:numPr>
         <w:pStyle w:val="Compact"/>
       </w:pPr>
@@ -10382,7 +10775,7 @@
       <w:pPr>
         <w:numPr>
           <w:ilvl w:val="0"/>
-          <w:numId w:val="1024"/>
+          <w:numId w:val="1026"/>
         </w:numPr>
         <w:pStyle w:val="Compact"/>
       </w:pPr>
@@ -10425,18 +10818,18 @@
           <wp:inline>
             <wp:extent cx="3264407" cy="3361853"/>
             <wp:effectExtent b="0" l="0" r="0" t="0"/>
-            <wp:docPr descr="The Dataverse panel" title="" id="114" name="Picture"/>
+            <wp:docPr descr="The Dataverse panel" title="" id="118" name="Picture"/>
             <a:graphic>
               <a:graphicData uri="http://schemas.openxmlformats.org/drawingml/2006/picture">
                 <pic:pic>
                   <pic:nvPicPr>
-                    <pic:cNvPr descr="images/16-dataverse.png" id="115" name="Picture"/>
+                    <pic:cNvPr descr="images/16-dataverse.png" id="119" name="Picture"/>
                     <pic:cNvPicPr>
                       <a:picLocks noChangeArrowheads="1" noChangeAspect="1"/>
                     </pic:cNvPicPr>
                   </pic:nvPicPr>
                   <pic:blipFill>
-                    <a:blip r:embed="rId113"/>
+                    <a:blip r:embed="rId117"/>
                     <a:stretch>
                       <a:fillRect/>
                     </a:stretch>
@@ -10694,8 +11087,8 @@
         </w:tc>
       </w:tr>
     </w:tbl>
-    <w:bookmarkEnd w:id="116"/>
-    <w:bookmarkStart w:id="117" w:name="publishers-and-prefixes"/>
+    <w:bookmarkEnd w:id="120"/>
+    <w:bookmarkStart w:id="121" w:name="publishers-and-prefixes"/>
     <w:p>
       <w:pPr>
         <w:pStyle w:val="Heading2"/>
@@ -10765,7 +11158,7 @@
       <w:pPr>
         <w:numPr>
           <w:ilvl w:val="0"/>
-          <w:numId w:val="1025"/>
+          <w:numId w:val="1027"/>
         </w:numPr>
         <w:pStyle w:val="Compact"/>
       </w:pPr>
@@ -10787,7 +11180,7 @@
       <w:pPr>
         <w:numPr>
           <w:ilvl w:val="0"/>
-          <w:numId w:val="1025"/>
+          <w:numId w:val="1027"/>
         </w:numPr>
         <w:pStyle w:val="Compact"/>
       </w:pPr>
@@ -10809,7 +11202,7 @@
       <w:pPr>
         <w:numPr>
           <w:ilvl w:val="0"/>
-          <w:numId w:val="1025"/>
+          <w:numId w:val="1027"/>
         </w:numPr>
         <w:pStyle w:val="Compact"/>
       </w:pPr>
@@ -10831,7 +11224,7 @@
       <w:pPr>
         <w:numPr>
           <w:ilvl w:val="0"/>
-          <w:numId w:val="1025"/>
+          <w:numId w:val="1027"/>
         </w:numPr>
         <w:pStyle w:val="Compact"/>
       </w:pPr>
@@ -10934,7 +11327,7 @@
       <w:pPr>
         <w:numPr>
           <w:ilvl w:val="0"/>
-          <w:numId w:val="1025"/>
+          <w:numId w:val="1027"/>
         </w:numPr>
         <w:pStyle w:val="Compact"/>
       </w:pPr>
@@ -10958,8 +11351,8 @@
         <w:t xml:space="preserve">goes back to guessing your prefixes from the custom tables, as before.</w:t>
       </w:r>
     </w:p>
-    <w:bookmarkEnd w:id="117"/>
-    <w:bookmarkStart w:id="121" w:name="generating-a-dataverse-solution"/>
+    <w:bookmarkEnd w:id="121"/>
+    <w:bookmarkStart w:id="125" w:name="generating-a-dataverse-solution"/>
     <w:p>
       <w:pPr>
         <w:pStyle w:val="Heading2"/>
@@ -11019,7 +11412,7 @@
       <w:pPr>
         <w:numPr>
           <w:ilvl w:val="0"/>
-          <w:numId w:val="1026"/>
+          <w:numId w:val="1028"/>
         </w:numPr>
         <w:pStyle w:val="Compact"/>
       </w:pPr>
@@ -11073,7 +11466,7 @@
       <w:pPr>
         <w:numPr>
           <w:ilvl w:val="0"/>
-          <w:numId w:val="1026"/>
+          <w:numId w:val="1028"/>
         </w:numPr>
         <w:pStyle w:val="Compact"/>
       </w:pPr>
@@ -11085,7 +11478,7 @@
       <w:pPr>
         <w:numPr>
           <w:ilvl w:val="0"/>
-          <w:numId w:val="1026"/>
+          <w:numId w:val="1028"/>
         </w:numPr>
         <w:pStyle w:val="Compact"/>
       </w:pPr>
@@ -11110,7 +11503,7 @@
       <w:pPr>
         <w:numPr>
           <w:ilvl w:val="0"/>
-          <w:numId w:val="1026"/>
+          <w:numId w:val="1028"/>
         </w:numPr>
         <w:pStyle w:val="Compact"/>
       </w:pPr>
@@ -11152,18 +11545,18 @@
           <wp:inline>
             <wp:extent cx="4828032" cy="4291584"/>
             <wp:effectExtent b="0" l="0" r="0" t="0"/>
-            <wp:docPr descr="The Build a Dataverse solution dialog" title="" id="119" name="Picture"/>
+            <wp:docPr descr="The Build a Dataverse solution dialog" title="" id="123" name="Picture"/>
             <a:graphic>
               <a:graphicData uri="http://schemas.openxmlformats.org/drawingml/2006/picture">
                 <pic:pic>
                   <pic:nvPicPr>
-                    <pic:cNvPr descr="images/17-solution.png" id="120" name="Picture"/>
+                    <pic:cNvPr descr="images/17-solution.png" id="124" name="Picture"/>
                     <pic:cNvPicPr>
                       <a:picLocks noChangeArrowheads="1" noChangeAspect="1"/>
                     </pic:cNvPicPr>
                   </pic:nvPicPr>
                   <pic:blipFill>
-                    <a:blip r:embed="rId118"/>
+                    <a:blip r:embed="rId122"/>
                     <a:stretch>
                       <a:fillRect/>
                     </a:stretch>
@@ -11846,8 +12239,8 @@
         </w:tc>
       </w:tr>
     </w:tbl>
-    <w:bookmarkEnd w:id="121"/>
-    <w:bookmarkStart w:id="122" w:name="importing-the-solution"/>
+    <w:bookmarkEnd w:id="125"/>
+    <w:bookmarkStart w:id="126" w:name="importing-the-solution"/>
     <w:p>
       <w:pPr>
         <w:pStyle w:val="Heading2"/>
@@ -11884,7 +12277,7 @@
       <w:pPr>
         <w:numPr>
           <w:ilvl w:val="0"/>
-          <w:numId w:val="1027"/>
+          <w:numId w:val="1029"/>
         </w:numPr>
       </w:pPr>
       <w:r>
@@ -11895,7 +12288,7 @@
       <w:pPr>
         <w:numPr>
           <w:ilvl w:val="0"/>
-          <w:numId w:val="1027"/>
+          <w:numId w:val="1029"/>
         </w:numPr>
       </w:pPr>
       <w:r>
@@ -12005,7 +12398,7 @@
       <w:pPr>
         <w:numPr>
           <w:ilvl w:val="0"/>
-          <w:numId w:val="1027"/>
+          <w:numId w:val="1029"/>
         </w:numPr>
       </w:pPr>
       <w:r>
@@ -12025,7 +12418,7 @@
       <w:pPr>
         <w:numPr>
           <w:ilvl w:val="0"/>
-          <w:numId w:val="1027"/>
+          <w:numId w:val="1029"/>
         </w:numPr>
       </w:pPr>
       <w:r>
@@ -12036,7 +12429,7 @@
       <w:pPr>
         <w:numPr>
           <w:ilvl w:val="0"/>
-          <w:numId w:val="1027"/>
+          <w:numId w:val="1029"/>
         </w:numPr>
       </w:pPr>
       <w:r>
@@ -12216,8 +12609,8 @@
         <w:t xml:space="preserve">downloads the script on its own, to import a solution zip you already have.</w:t>
       </w:r>
     </w:p>
-    <w:bookmarkEnd w:id="122"/>
-    <w:bookmarkStart w:id="123" w:name="after-the-import"/>
+    <w:bookmarkEnd w:id="126"/>
+    <w:bookmarkStart w:id="127" w:name="after-the-import"/>
     <w:p>
       <w:pPr>
         <w:pStyle w:val="Heading2"/>
@@ -12230,7 +12623,7 @@
       <w:pPr>
         <w:numPr>
           <w:ilvl w:val="0"/>
-          <w:numId w:val="1028"/>
+          <w:numId w:val="1030"/>
         </w:numPr>
         <w:pStyle w:val="Compact"/>
       </w:pPr>
@@ -12270,7 +12663,7 @@
       <w:pPr>
         <w:numPr>
           <w:ilvl w:val="0"/>
-          <w:numId w:val="1028"/>
+          <w:numId w:val="1030"/>
         </w:numPr>
         <w:pStyle w:val="Compact"/>
       </w:pPr>
@@ -12297,7 +12690,7 @@
       <w:pPr>
         <w:numPr>
           <w:ilvl w:val="0"/>
-          <w:numId w:val="1028"/>
+          <w:numId w:val="1030"/>
         </w:numPr>
         <w:pStyle w:val="Compact"/>
       </w:pPr>
@@ -12325,7 +12718,7 @@
       <w:pPr>
         <w:numPr>
           <w:ilvl w:val="0"/>
-          <w:numId w:val="1028"/>
+          <w:numId w:val="1030"/>
         </w:numPr>
         <w:pStyle w:val="Compact"/>
       </w:pPr>
@@ -12337,7 +12730,7 @@
       <w:pPr>
         <w:numPr>
           <w:ilvl w:val="0"/>
-          <w:numId w:val="1028"/>
+          <w:numId w:val="1030"/>
         </w:numPr>
         <w:pStyle w:val="Compact"/>
       </w:pPr>
@@ -12349,7 +12742,7 @@
       <w:pPr>
         <w:numPr>
           <w:ilvl w:val="0"/>
-          <w:numId w:val="1028"/>
+          <w:numId w:val="1030"/>
         </w:numPr>
         <w:pStyle w:val="Compact"/>
       </w:pPr>
@@ -12373,8 +12766,8 @@
         <w:t xml:space="preserve">for test and production.</w:t>
       </w:r>
     </w:p>
-    <w:bookmarkEnd w:id="123"/>
-    <w:bookmarkStart w:id="124" w:name="troubleshooting-and-faq"/>
+    <w:bookmarkEnd w:id="127"/>
+    <w:bookmarkStart w:id="128" w:name="troubleshooting-and-faq"/>
     <w:p>
       <w:pPr>
         <w:pStyle w:val="Heading2"/>
@@ -13411,8 +13804,8 @@
         </w:tc>
       </w:tr>
     </w:tbl>
-    <w:bookmarkEnd w:id="124"/>
-    <w:bookmarkStart w:id="125" w:name="reference-the-workbook-layout"/>
+    <w:bookmarkEnd w:id="128"/>
+    <w:bookmarkStart w:id="129" w:name="reference-the-workbook-layout"/>
     <w:p>
       <w:pPr>
         <w:pStyle w:val="Heading2"/>
@@ -14391,7 +14784,7 @@
       <w:pPr>
         <w:numPr>
           <w:ilvl w:val="0"/>
-          <w:numId w:val="1029"/>
+          <w:numId w:val="1031"/>
         </w:numPr>
         <w:pStyle w:val="Compact"/>
       </w:pPr>
@@ -14427,7 +14820,7 @@
       <w:pPr>
         <w:numPr>
           <w:ilvl w:val="0"/>
-          <w:numId w:val="1029"/>
+          <w:numId w:val="1031"/>
         </w:numPr>
         <w:pStyle w:val="Compact"/>
       </w:pPr>
@@ -14472,7 +14865,7 @@
       <w:pPr>
         <w:numPr>
           <w:ilvl w:val="0"/>
-          <w:numId w:val="1029"/>
+          <w:numId w:val="1031"/>
         </w:numPr>
         <w:pStyle w:val="Compact"/>
       </w:pPr>
@@ -14508,7 +14901,7 @@
       <w:pPr>
         <w:numPr>
           <w:ilvl w:val="0"/>
-          <w:numId w:val="1029"/>
+          <w:numId w:val="1031"/>
         </w:numPr>
         <w:pStyle w:val="Compact"/>
       </w:pPr>
@@ -14553,7 +14946,7 @@
       <w:pPr>
         <w:numPr>
           <w:ilvl w:val="0"/>
-          <w:numId w:val="1029"/>
+          <w:numId w:val="1031"/>
         </w:numPr>
         <w:pStyle w:val="Compact"/>
       </w:pPr>
@@ -14616,7 +15009,7 @@
       <w:pPr>
         <w:numPr>
           <w:ilvl w:val="0"/>
-          <w:numId w:val="1029"/>
+          <w:numId w:val="1031"/>
         </w:numPr>
         <w:pStyle w:val="Compact"/>
       </w:pPr>
@@ -14808,7 +15201,7 @@
         <w:t xml:space="preserve">, and written to the file with the first value you save in them. A column you add to the template’s header row is read, shown, filterable and editable too.</w:t>
       </w:r>
     </w:p>
-    <w:bookmarkEnd w:id="125"/>
+    <w:bookmarkEnd w:id="129"/>
     <w:sectPr/>
   </w:body>
 </w:document>
@@ -15446,6 +15839,9 @@
     </w:lvlOverride>
   </w:num>
   <w:num w:numId="1024">
+    <w:abstractNumId w:val="991"/>
+  </w:num>
+  <w:num w:numId="1025">
     <w:abstractNumId w:val="99411"/>
     <w:lvlOverride w:ilvl="0">
       <w:startOverride w:val="1"/>
@@ -15474,9 +15870,6 @@
     <w:lvlOverride w:ilvl="8">
       <w:startOverride w:val="1"/>
     </w:lvlOverride>
-  </w:num>
-  <w:num w:numId="1025">
-    <w:abstractNumId w:val="991"/>
   </w:num>
   <w:num w:numId="1026">
     <w:abstractNumId w:val="99411"/>
@@ -15509,34 +15902,7 @@
     </w:lvlOverride>
   </w:num>
   <w:num w:numId="1027">
-    <w:abstractNumId w:val="99411"/>
-    <w:lvlOverride w:ilvl="0">
-      <w:startOverride w:val="1"/>
-    </w:lvlOverride>
-    <w:lvlOverride w:ilvl="1">
-      <w:startOverride w:val="1"/>
-    </w:lvlOverride>
-    <w:lvlOverride w:ilvl="2">
-      <w:startOverride w:val="1"/>
-    </w:lvlOverride>
-    <w:lvlOverride w:ilvl="3">
-      <w:startOverride w:val="1"/>
-    </w:lvlOverride>
-    <w:lvlOverride w:ilvl="4">
-      <w:startOverride w:val="1"/>
-    </w:lvlOverride>
-    <w:lvlOverride w:ilvl="5">
-      <w:startOverride w:val="1"/>
-    </w:lvlOverride>
-    <w:lvlOverride w:ilvl="6">
-      <w:startOverride w:val="1"/>
-    </w:lvlOverride>
-    <w:lvlOverride w:ilvl="7">
-      <w:startOverride w:val="1"/>
-    </w:lvlOverride>
-    <w:lvlOverride w:ilvl="8">
-      <w:startOverride w:val="1"/>
-    </w:lvlOverride>
+    <w:abstractNumId w:val="991"/>
   </w:num>
   <w:num w:numId="1028">
     <w:abstractNumId w:val="99411"/>
@@ -15569,6 +15935,66 @@
     </w:lvlOverride>
   </w:num>
   <w:num w:numId="1029">
+    <w:abstractNumId w:val="99411"/>
+    <w:lvlOverride w:ilvl="0">
+      <w:startOverride w:val="1"/>
+    </w:lvlOverride>
+    <w:lvlOverride w:ilvl="1">
+      <w:startOverride w:val="1"/>
+    </w:lvlOverride>
+    <w:lvlOverride w:ilvl="2">
+      <w:startOverride w:val="1"/>
+    </w:lvlOverride>
+    <w:lvlOverride w:ilvl="3">
+      <w:startOverride w:val="1"/>
+    </w:lvlOverride>
+    <w:lvlOverride w:ilvl="4">
+      <w:startOverride w:val="1"/>
+    </w:lvlOverride>
+    <w:lvlOverride w:ilvl="5">
+      <w:startOverride w:val="1"/>
+    </w:lvlOverride>
+    <w:lvlOverride w:ilvl="6">
+      <w:startOverride w:val="1"/>
+    </w:lvlOverride>
+    <w:lvlOverride w:ilvl="7">
+      <w:startOverride w:val="1"/>
+    </w:lvlOverride>
+    <w:lvlOverride w:ilvl="8">
+      <w:startOverride w:val="1"/>
+    </w:lvlOverride>
+  </w:num>
+  <w:num w:numId="1030">
+    <w:abstractNumId w:val="99411"/>
+    <w:lvlOverride w:ilvl="0">
+      <w:startOverride w:val="1"/>
+    </w:lvlOverride>
+    <w:lvlOverride w:ilvl="1">
+      <w:startOverride w:val="1"/>
+    </w:lvlOverride>
+    <w:lvlOverride w:ilvl="2">
+      <w:startOverride w:val="1"/>
+    </w:lvlOverride>
+    <w:lvlOverride w:ilvl="3">
+      <w:startOverride w:val="1"/>
+    </w:lvlOverride>
+    <w:lvlOverride w:ilvl="4">
+      <w:startOverride w:val="1"/>
+    </w:lvlOverride>
+    <w:lvlOverride w:ilvl="5">
+      <w:startOverride w:val="1"/>
+    </w:lvlOverride>
+    <w:lvlOverride w:ilvl="6">
+      <w:startOverride w:val="1"/>
+    </w:lvlOverride>
+    <w:lvlOverride w:ilvl="7">
+      <w:startOverride w:val="1"/>
+    </w:lvlOverride>
+    <w:lvlOverride w:ilvl="8">
+      <w:startOverride w:val="1"/>
+    </w:lvlOverride>
+  </w:num>
+  <w:num w:numId="1031">
     <w:abstractNumId w:val="991"/>
   </w:num>
 </w:numbering>

</xml_diff>